<commit_message>
WIP: FlowJo v10 export keyword/compensation reconstruction, fix transformations fallback, and add count extraction script
- Reconstruct original FCS header keywords for FlowJo v10 export to avoid
  Comp- prefixed channel names in output workspaces.
- Parse SPILL keyword into compensation matrix for exported samples.
- Fix subscript out of bounds when transformations list is empty in
  create_gatingset_from_cytoset().
- Add extract_flowjo_counts.R script to extract population counts from all
  .flowjo files under flowjo_export_tests/.
- Update export-flowjo10 tests and manuscript annex.

Co-Authored-By: Claude <noreply@anthropic.com>
</commit_message>
<xml_diff>
--- a/manuscript/CyFj11.v1.docx
+++ b/manuscript/CyFj11.v1.docx
@@ -20,7 +20,7 @@
         <w:rPr>
           <w:noProof/>
         </w:rPr>
-        <w:pict w14:anchorId="104F48C3">
+        <w:pict w14:anchorId="479AC3F8">
           <v:rect id="_x0000_i1042" alt="" style="width:451.3pt;height:.05pt;mso-width-percent:0;mso-height-percent:0;mso-width-percent:0;mso-height-percent:0" o:hralign="center" o:hrstd="t" o:hr="t"/>
         </w:pict>
       </w:r>
@@ -511,7 +511,7 @@
         <w:rPr>
           <w:noProof/>
         </w:rPr>
-        <w:pict w14:anchorId="0ACFB5B8">
+        <w:pict w14:anchorId="5076FF45">
           <v:rect id="_x0000_i1041" alt="" style="width:451.3pt;height:.05pt;mso-width-percent:0;mso-height-percent:0;mso-width-percent:0;mso-height-percent:0" o:hralign="center" o:hrstd="t" o:hr="t"/>
         </w:pict>
       </w:r>
@@ -596,7 +596,7 @@
         <w:rPr>
           <w:noProof/>
         </w:rPr>
-        <w:pict w14:anchorId="27E74770">
+        <w:pict w14:anchorId="0F3E38B2">
           <v:rect id="_x0000_i1040" alt="" style="width:451.3pt;height:.05pt;mso-width-percent:0;mso-height-percent:0;mso-width-percent:0;mso-height-percent:0" o:hralign="center" o:hrstd="t" o:hr="t"/>
         </w:pict>
       </w:r>
@@ -877,6 +877,7 @@
       </w:pPr>
       <w:r>
         <w:rPr>
+          <w:noProof/>
           <w:lang w:val="en-US"/>
         </w:rPr>
         <w:drawing>
@@ -2501,7 +2502,7 @@
           <w:szCs w:val="24"/>
           <w:lang w:val="en-FR" w:eastAsia="en-GB"/>
         </w:rPr>
-        <w:pict w14:anchorId="631BA505">
+        <w:pict w14:anchorId="665DA1D4">
           <v:rect id="_x0000_i1039" alt="" style="width:451.3pt;height:.05pt;mso-width-percent:0;mso-height-percent:0;mso-width-percent:0;mso-height-percent:0" o:hralign="center" o:hrstd="t" o:hr="t" fillcolor="#a0a0a0" stroked="f"/>
         </w:pict>
       </w:r>
@@ -5841,7 +5842,7 @@
         <w:rPr>
           <w:noProof/>
         </w:rPr>
-        <w:pict w14:anchorId="02795C98">
+        <w:pict w14:anchorId="1FDF4CC8">
           <v:rect id="_x0000_i1038" alt="" style="width:451.3pt;height:.05pt;mso-width-percent:0;mso-height-percent:0;mso-width-percent:0;mso-height-percent:0" o:hralign="center" o:hrstd="t" o:hr="t"/>
         </w:pict>
       </w:r>
@@ -6020,7 +6021,7 @@
         <w:rPr>
           <w:noProof/>
         </w:rPr>
-        <w:pict w14:anchorId="0A82F98B">
+        <w:pict w14:anchorId="1F8E856A">
           <v:rect id="_x0000_i1037" alt="" style="width:451.3pt;height:.05pt;mso-width-percent:0;mso-height-percent:0;mso-width-percent:0;mso-height-percent:0" o:hralign="center" o:hrstd="t" o:hr="t" fillcolor="#a0a0a0" stroked="f"/>
         </w:pict>
       </w:r>
@@ -6070,7 +6071,7 @@
         <w:rPr>
           <w:noProof/>
         </w:rPr>
-        <w:pict w14:anchorId="28E6DA1A">
+        <w:pict w14:anchorId="0205621C">
           <v:rect id="_x0000_i1036" alt="" style="width:451.3pt;height:.05pt;mso-width-percent:0;mso-height-percent:0;mso-width-percent:0;mso-height-percent:0" o:hralign="center" o:hrstd="t" o:hr="t"/>
         </w:pict>
       </w:r>
@@ -6469,11 +6470,33 @@
       </w:pPr>
       <w:r>
         <w:rPr>
-          <w:rFonts w:ascii="Segoe UI" w:hAnsi="Segoe UI" w:cs="Segoe UI"/>
-          <w:color w:val="212121"/>
+          <w:rFonts w:ascii="Arial" w:hAnsi="Arial" w:cs="Arial"/>
+          <w:color w:val="273437"/>
+          <w:sz w:val="27"/>
+          <w:szCs w:val="27"/>
           <w:shd w:val="clear" w:color="auto" w:fill="FFFFFF"/>
         </w:rPr>
-        <w:t>Patin E, Hasan M, Bergstedt J, Rouilly V, Libri V, Urrutia A, Alanio C, Scepanovic P, Hammer C, Jönsson F, Beitz B, Quach H, Lim YW, Hunkapiller J, Zepeda M, Green C, Piasecka B, Leloup C, Rogge L, Huetz F, Peguillet I, Lantz O, Fontes M, Di Santo JP, Thomas S, Fellay J, Duffy D, Quintana-Murci L, Albert ML; Milieu Intérieur Consortium. Natural variation in the parameters of innate immune cells is preferentially driven by genetic factors. Nat Immunol. 2018 Mar;19(3):302-314. doi: 10.1038/s41590-018-0049-7. Epub 2018 Feb 23. Erratum in: Nat Immunol. 2018 Jun;19(6):645. doi: 10.1038/s41590-018-0105-3. PMID: 29476184.</w:t>
+        <w:t>FlowJo™ Software Version </w:t>
+      </w:r>
+      <w:r>
+        <w:rPr>
+          <w:rFonts w:ascii="Arial" w:hAnsi="Arial" w:cs="Arial"/>
+          <w:color w:val="273437"/>
+          <w:sz w:val="27"/>
+          <w:szCs w:val="27"/>
+          <w:shd w:val="clear" w:color="auto" w:fill="FFFFFF"/>
+        </w:rPr>
+        <w:t>10 &amp; 11</w:t>
+      </w:r>
+      <w:r>
+        <w:rPr>
+          <w:rFonts w:ascii="Arial" w:hAnsi="Arial" w:cs="Arial"/>
+          <w:color w:val="273437"/>
+          <w:sz w:val="27"/>
+          <w:szCs w:val="27"/>
+          <w:shd w:val="clear" w:color="auto" w:fill="FFFFFF"/>
+        </w:rPr>
+        <w:t>. Becton, Dickinson and Company; 2023.</w:t>
       </w:r>
     </w:p>
     <w:p>
@@ -6489,51 +6512,8 @@
       </w:pPr>
       <w:r>
         <w:rPr>
-          <w:rFonts w:ascii="Arial" w:hAnsi="Arial" w:cs="Arial"/>
-          <w:color w:val="273437"/>
-          <w:sz w:val="27"/>
-          <w:szCs w:val="27"/>
-          <w:shd w:val="clear" w:color="auto" w:fill="FFFFFF"/>
-        </w:rPr>
-        <w:t>FlowJo™ Software Version </w:t>
-      </w:r>
-      <w:r>
-        <w:rPr>
-          <w:rFonts w:ascii="Arial" w:hAnsi="Arial" w:cs="Arial"/>
-          <w:color w:val="273437"/>
-          <w:sz w:val="27"/>
-          <w:szCs w:val="27"/>
-          <w:shd w:val="clear" w:color="auto" w:fill="FFFFFF"/>
-        </w:rPr>
-        <w:t>10 &amp; 11</w:t>
-      </w:r>
-      <w:r>
-        <w:rPr>
-          <w:rFonts w:ascii="Arial" w:hAnsi="Arial" w:cs="Arial"/>
-          <w:color w:val="273437"/>
-          <w:sz w:val="27"/>
-          <w:szCs w:val="27"/>
-          <w:shd w:val="clear" w:color="auto" w:fill="FFFFFF"/>
-        </w:rPr>
-        <w:t>. Becton, Dickinson and Company; 2023.</w:t>
-      </w:r>
-    </w:p>
-    <w:p>
-      <w:pPr>
-        <w:pStyle w:val="NormalWeb"/>
-        <w:numPr>
-          <w:ilvl w:val="0"/>
-          <w:numId w:val="6"/>
-        </w:numPr>
-        <w:rPr>
           <w:color w:val="EE0000"/>
         </w:rPr>
-      </w:pPr>
-      <w:r>
-        <w:rPr>
-          <w:color w:val="EE0000"/>
-        </w:rPr>
-        <w:lastRenderedPageBreak/>
         <w:t>Ellis B, Haaland P, Hahne F, Le Meur N, Gopalakrishnan N, Spidlen J, Jiang M, Finak G (2026). _flowCore: flowCore: Basic structures for flow cytometry data. doi:10.18129/B9.bioc.flowCore &lt;https://doi.org/10.18129/B9.bioc.flowCore&gt;, R package version 2.22.1, &lt;https://bioconductor.org/packages/flowCore&gt;.</w:t>
       </w:r>
     </w:p>
@@ -6677,6 +6657,7 @@
           <w:color w:val="1B1B1B"/>
           <w:shd w:val="clear" w:color="auto" w:fill="FFFFFF"/>
         </w:rPr>
+        <w:lastRenderedPageBreak/>
         <w:t>Finak G, Jiang W, Gottardo R. CytoML for cross-platform cytometry data sharing. Cytometry A. 2018 Dec;93(12):1189-1196. doi: 10.1002/cyto.a.23663. PMID: 30551257; PMCID: PMC6443375.</w:t>
       </w:r>
     </w:p>
@@ -6704,7 +6685,7 @@
         <w:rPr>
           <w:noProof/>
         </w:rPr>
-        <w:pict w14:anchorId="59F848E2">
+        <w:pict w14:anchorId="4AE72145">
           <v:rect id="_x0000_i1035" alt="" style="width:451.3pt;height:.05pt;mso-width-percent:0;mso-height-percent:0;mso-width-percent:0;mso-height-percent:0" o:hralign="center" o:hrstd="t" o:hr="t"/>
         </w:pict>
       </w:r>
@@ -6804,7 +6785,7 @@
         <w:rPr>
           <w:noProof/>
         </w:rPr>
-        <w:pict w14:anchorId="7587933A">
+        <w:pict w14:anchorId="20D3C124">
           <v:rect id="_x0000_i1034" alt="" style="width:451.3pt;height:.05pt;mso-width-percent:0;mso-height-percent:0;mso-width-percent:0;mso-height-percent:0" o:hralign="center" o:hrstd="t" o:hr="t" fillcolor="#a0a0a0" stroked="f"/>
         </w:pict>
       </w:r>
@@ -8533,7 +8514,7 @@
         <w:rPr>
           <w:noProof/>
         </w:rPr>
-        <w:pict w14:anchorId="2A17648C">
+        <w:pict w14:anchorId="04560397">
           <v:rect id="_x0000_i1033" alt="" style="width:451.3pt;height:.05pt;mso-width-percent:0;mso-height-percent:0;mso-width-percent:0;mso-height-percent:0" o:hralign="center" o:hrstd="t" o:hr="t"/>
         </w:pict>
       </w:r>
@@ -9601,7 +9582,7 @@
         <w:rPr>
           <w:noProof/>
         </w:rPr>
-        <w:pict w14:anchorId="7C66FCD4">
+        <w:pict w14:anchorId="7D3CEFC5">
           <v:rect id="_x0000_i1032" alt="" style="width:451.3pt;height:.05pt;mso-width-percent:0;mso-height-percent:0;mso-width-percent:0;mso-height-percent:0" o:hralign="center" o:hrstd="t" o:hr="t"/>
         </w:pict>
       </w:r>
@@ -9672,7 +9653,7 @@
         <w:rPr>
           <w:noProof/>
         </w:rPr>
-        <w:pict w14:anchorId="3F7DC46F">
+        <w:pict w14:anchorId="09AB7095">
           <v:rect id="_x0000_i1031" alt="" style="width:451.3pt;height:.05pt;mso-width-percent:0;mso-height-percent:0;mso-width-percent:0;mso-height-percent:0" o:hralign="center" o:hrstd="t" o:hr="t"/>
         </w:pict>
       </w:r>
@@ -9924,7 +9905,7 @@
         <w:rPr>
           <w:noProof/>
         </w:rPr>
-        <w:pict w14:anchorId="67144678">
+        <w:pict w14:anchorId="1385BA7D">
           <v:rect id="_x0000_i1030" alt="" style="width:451.3pt;height:.05pt;mso-width-percent:0;mso-height-percent:0;mso-width-percent:0;mso-height-percent:0" o:hralign="center" o:hrstd="t" o:hr="t"/>
         </w:pict>
       </w:r>
@@ -10517,7 +10498,7 @@
         <w:rPr>
           <w:noProof/>
         </w:rPr>
-        <w:pict w14:anchorId="405AEA2A">
+        <w:pict w14:anchorId="1E83653A">
           <v:rect id="_x0000_i1029" alt="" style="width:451.3pt;height:.05pt;mso-width-percent:0;mso-height-percent:0;mso-width-percent:0;mso-height-percent:0" o:hralign="center" o:hrstd="t" o:hr="t"/>
         </w:pict>
       </w:r>
@@ -10959,7 +10940,7 @@
         <w:rPr>
           <w:noProof/>
         </w:rPr>
-        <w:pict w14:anchorId="493CB254">
+        <w:pict w14:anchorId="5B59FDF0">
           <v:rect id="_x0000_i1028" alt="" style="width:451.3pt;height:.05pt;mso-width-percent:0;mso-height-percent:0;mso-width-percent:0;mso-height-percent:0" o:hralign="center" o:hrstd="t" o:hr="t"/>
         </w:pict>
       </w:r>
@@ -11347,7 +11328,7 @@
           <w:noProof/>
         </w:rPr>
         <w:lastRenderedPageBreak/>
-        <w:pict w14:anchorId="23693D82">
+        <w:pict w14:anchorId="20B78F21">
           <v:rect id="_x0000_i1027" alt="" style="width:451.3pt;height:.05pt;mso-width-percent:0;mso-height-percent:0;mso-width-percent:0;mso-height-percent:0" o:hralign="center" o:hrstd="t" o:hr="t"/>
         </w:pict>
       </w:r>
@@ -11889,7 +11870,7 @@
         <w:rPr>
           <w:noProof/>
         </w:rPr>
-        <w:pict w14:anchorId="027CD118">
+        <w:pict w14:anchorId="6153EAF5">
           <v:rect id="_x0000_i1026" alt="" style="width:451.3pt;height:.05pt;mso-width-percent:0;mso-height-percent:0;mso-width-percent:0;mso-height-percent:0" o:hralign="center" o:hrstd="t" o:hr="t"/>
         </w:pict>
       </w:r>
@@ -12743,7 +12724,7 @@
         <w:rPr>
           <w:noProof/>
         </w:rPr>
-        <w:pict w14:anchorId="31E31772">
+        <w:pict w14:anchorId="60600DAD">
           <v:rect id="_x0000_i1025" alt="" style="width:451.3pt;height:.05pt;mso-width-percent:0;mso-height-percent:0;mso-width-percent:0;mso-height-percent:0" o:hralign="center" o:hrstd="t" o:hr="t"/>
         </w:pict>
       </w:r>
@@ -13805,6 +13786,7 @@
               <w:listItem w:displayText="Charte d'interface" w:value="Charte d'interface"/>
             </w:comboBox>
           </w:sdtPr>
+          <w:sdtEndPr/>
           <w:sdtContent>
             <w:p>
               <w:pPr>
@@ -13852,6 +13834,7 @@
             <w:tag w:val="Titre du document"/>
             <w:id w:val="1333951588"/>
           </w:sdtPr>
+          <w:sdtEndPr/>
           <w:sdtContent>
             <w:p>
               <w:pPr>
@@ -13866,6 +13849,7 @@
                   <w:tag w:val="Titre du document"/>
                   <w:id w:val="1176691391"/>
                 </w:sdtPr>
+                <w:sdtEndPr/>
                 <w:sdtContent>
                   <w:r>
                     <w:t>scBiomarker</w:t>
@@ -13898,6 +13882,11 @@
               <w:docPartGallery w:val="Quick Parts"/>
             </w:docPartList>
           </w:sdtPr>
+          <w:sdtEndPr>
+            <w:rPr>
+              <w:rStyle w:val="PlaceholderText"/>
+            </w:rPr>
+          </w:sdtEndPr>
           <w:sdtContent>
             <w:p>
               <w:pPr>
@@ -13915,6 +13904,7 @@
                   <w:tag w:val="Titre du document"/>
                   <w:id w:val="-1129321394"/>
                 </w:sdtPr>
+                <w:sdtEndPr/>
                 <w:sdtContent>
                   <w:r>
                     <w:rPr>
@@ -13933,6 +13923,7 @@
                       <w:tag w:val="Titre du document"/>
                       <w:id w:val="-1145736350"/>
                     </w:sdtPr>
+                    <w:sdtEndPr/>
                     <w:sdtContent>
                       <w:r>
                         <w:rPr>
@@ -13986,6 +13977,7 @@
             <w:listItem w:displayText="Z" w:value="Z"/>
           </w:comboBox>
         </w:sdtPr>
+        <w:sdtEndPr/>
         <w:sdtContent>
           <w:tc>
             <w:tcPr>

</xml_diff>